<commit_message>
feat: add automation scripts for research paper document assembly and architecture diagram generation
</commit_message>
<xml_diff>
--- a/research/Research_Paper_IEEE_Formatted_submit_ready.docx
+++ b/research/Research_Paper_IEEE_Formatted_submit_ready.docx
@@ -379,7 +379,21 @@
         <w:rPr>
           <w:sz w:val="18"/>
         </w:rPr>
-        <w:t xml:space="preserve"> Traditional vulnerability testing often relies on manual penetration testing or static heuristic scanners. While these methods are effective to a degree, they are hard to scale and can miss complex, multi-step exploit chains. To solve this, we propose a more dynamic, intelligent approach: modeling the web vulnerability discovery process as a Markov Decision Process (MDP) and training an Extended Double Dueling Deep Q-Network (Extended D3QN) to navigate it. Our configured agent incorporates five major components of the state-of-the-art Rainbow DQN algorithm. By building a custom Gymnasium environment, WebSecurityGym, we train our agent against diverse mock applications containing real-world flaws like SQL Injection (SQLi) and Cross-Site Scripting (XSS). Guided by a Phase-Based Learning strategy that naturally progresses from reconnaissance to active exploitation, the agent successfully learns how to chain attacks autonomously, significantly outperforming traditional heuristic-based scanners in uncovering deeply hidden vulnerabilities while successfully minimizing false positives.</w:t>
+        <w:t xml:space="preserve"> Traditional vulnerability testing often relies on manual penetration testing or static heuristic scanners. While these methods are effective to a degree, they are hard to scale and can miss complex, multi-step exploit chains. To solve this, we propose a more dynamic, intelligent approach: modeling the web vulnerability discovery process as a Markov Decision Process (MDP) and training an Extended Double Dueling Deep Q-Network (Extended D3QN) to navigate it. Our configured agent incorporates five major components of the state-of-the-art Rainbow DQN algorithm. By building a custom Gymnasium environment, </w:t>
+      </w:r>
+      <w:proofErr w:type="spellStart"/>
+      <w:r>
+        <w:rPr>
+          <w:sz w:val="18"/>
+        </w:rPr>
+        <w:t>WebSecurityGym</w:t>
+      </w:r>
+      <w:proofErr w:type="spellEnd"/>
+      <w:r>
+        <w:rPr>
+          <w:sz w:val="18"/>
+        </w:rPr>
+        <w:t>, we train our agent against diverse mock applications containing real-world flaws like SQL Injection (SQLi) and Cross-Site Scripting (XSS). Guided by a Phase-Based Learning strategy that naturally progresses from reconnaissance to active exploitation, the agent successfully learns how to chain attacks autonomously, significantly outperforming traditional heuristic-based scanners in uncovering deeply hidden vulnerabilities while successfully minimizing false positives.</w:t>
       </w:r>
     </w:p>
     <w:p>
@@ -440,7 +454,15 @@
         <w:pStyle w:val="BodyText"/>
       </w:pPr>
       <w:r>
-        <w:t>In this work, we present a fully autonomous web vulnerability scanner driven by a Deep Q-Network (DQN) architecture. Our system leverages a custom environment, WebSecurityGym, which successfully abstracts standard HTTP interactions into states and actions. The “brain” of the scanner is implemented using an Extended D3QN—a partial Rainbow DQN combining Double Q-Learning, Dueling Networks, Prioritized Experience Replay, Noisy Networks, and Multi-Step Learning—to efficiently handle a large array of different payloads. To fast-track the agent’s learning, we also introduce a Phase-Based Learning strategy that mirrors the Cyber Kill Chain, locking advanced exploits until the agent has successfully mapped the application’s surface. Through extensive evaluation on multiple vulnerable mock targets, we show that this RL-based orchestrator holds massive potential for scaling intelligent, adaptive penetration testing.</w:t>
+        <w:t xml:space="preserve">In this work, we present a fully autonomous web vulnerability scanner driven by a Deep Q-Network (DQN) architecture. Our system leverages a custom environment, </w:t>
+      </w:r>
+      <w:proofErr w:type="spellStart"/>
+      <w:r>
+        <w:t>WebSecurityGym</w:t>
+      </w:r>
+      <w:proofErr w:type="spellEnd"/>
+      <w:r>
+        <w:t>, which successfully abstracts standard HTTP interactions into states and actions. The “brain” of the scanner is implemented using an Extended D3QN—a partial Rainbow DQN combining Double Q-Learning, Dueling Networks, Prioritized Experience Replay, Noisy Networks, and Multi-Step Learning—to efficiently handle a large array of different payloads. To fast-track the agent’s learning, we also introduce a Phase-Based Learning strategy that mirrors the Cyber Kill Chain, locking advanced exploits until the agent has successfully mapped the application’s surface. Through extensive evaluation on multiple vulnerable mock targets, we show that this RL-based orchestrator holds massive potential for scaling intelligent, adaptive penetration testing.</w:t>
       </w:r>
     </w:p>
     <w:p>
@@ -457,7 +479,13 @@
       <w:bookmarkStart w:id="1" w:name="ii.-related-work"/>
       <w:bookmarkEnd w:id="0"/>
       <w:r>
-        <w:t>II. RELATED WORK</w:t>
+        <w:t xml:space="preserve">II. RELATED </w:t>
+      </w:r>
+      <w:r>
+        <w:rPr>
+          <w:rFonts w:ascii="Times New Roman" w:hAnsi="Times New Roman" w:cs="Times New Roman"/>
+        </w:rPr>
+        <w:t>WORK</w:t>
       </w:r>
     </w:p>
     <w:p>
@@ -587,27 +615,33 @@
     <w:p>
       <w:pPr>
         <w:pStyle w:val="Heading2"/>
+        <w:numPr>
+          <w:ilvl w:val="0"/>
+          <w:numId w:val="6"/>
+        </w:numPr>
       </w:pPr>
       <w:bookmarkStart w:id="6" w:name="a.-system-architecture"/>
       <w:r>
-        <w:t>A. System Architecture</w:t>
-      </w:r>
-    </w:p>
-    <w:p>
-      <w:pPr>
-        <w:pStyle w:val="CaptionedFigure"/>
-        <w:spacing w:before="60"/>
-        <w:jc w:val="center"/>
+        <w:t>System Architecture</w:t>
+      </w:r>
+    </w:p>
+    <w:p>
+      <w:pPr>
+        <w:pStyle w:val="BodyText"/>
+        <w:rPr>
+          <w:rFonts w:eastAsiaTheme="minorEastAsia" w:hint="eastAsia"/>
+          <w:lang w:eastAsia="ja-JP"/>
+        </w:rPr>
       </w:pPr>
       <w:r>
         <w:rPr>
           <w:noProof/>
         </w:rPr>
         <w:drawing>
-          <wp:inline distT="0" distB="0" distL="0" distR="0" wp14:anchorId="400EEAD1" wp14:editId="17533749">
-            <wp:extent cx="2926080" cy="2933440"/>
+          <wp:inline distT="0" distB="0" distL="0" distR="0" wp14:anchorId="38FF9A5B" wp14:editId="686C6BF7">
+            <wp:extent cx="3094355" cy="3102091"/>
             <wp:effectExtent l="0" t="0" r="0" b="0"/>
-            <wp:docPr id="17" name="Picture" descr="D3QN Vulnerability Finder Architecture"/>
+            <wp:docPr id="1569755421" name="Picture" descr="D3QN Vulnerability Finder Architecture"/>
             <wp:cNvGraphicFramePr/>
             <a:graphic xmlns:a="http://schemas.openxmlformats.org/drawingml/2006/main">
               <a:graphicData uri="http://schemas.openxmlformats.org/drawingml/2006/picture">
@@ -627,7 +661,7 @@
                   <pic:spPr bwMode="auto">
                     <a:xfrm>
                       <a:off x="0" y="0"/>
-                      <a:ext cx="2926080" cy="2933440"/>
+                      <a:ext cx="3094355" cy="3102091"/>
                     </a:xfrm>
                     <a:prstGeom prst="rect">
                       <a:avLst/>
@@ -648,6 +682,13 @@
     </w:p>
     <w:p>
       <w:pPr>
+        <w:pStyle w:val="CaptionedFigure"/>
+        <w:spacing w:before="60"/>
+        <w:jc w:val="center"/>
+      </w:pPr>
+    </w:p>
+    <w:p>
+      <w:pPr>
         <w:pStyle w:val="ImageCaption"/>
       </w:pPr>
       <w:r>
@@ -745,10 +786,7 @@
         <w:pStyle w:val="FirstParagraph"/>
       </w:pPr>
       <w:r>
-        <w:t xml:space="preserve">To successfully apply RL to security, we model the interaction as a Markov Decision Process (MDP). This is </w:t>
-      </w:r>
-      <w:r>
-        <w:t xml:space="preserve">defined by a tuple </w:t>
+        <w:t xml:space="preserve">To successfully apply RL to security, we model the interaction as a Markov Decision Process (MDP). This is defined by a tuple </w:t>
       </w:r>
       <m:oMath>
         <m:r>
@@ -1066,6 +1104,10 @@
     <w:p>
       <w:pPr>
         <w:pStyle w:val="BodyText"/>
+        <w:rPr>
+          <w:rFonts w:eastAsiaTheme="minorEastAsia"/>
+          <w:lang w:eastAsia="ja-JP"/>
+        </w:rPr>
       </w:pPr>
       <m:oMathPara>
         <m:oMathParaPr>
@@ -1526,6 +1568,15 @@
     </w:p>
     <w:p>
       <w:pPr>
+        <w:pStyle w:val="BodyText"/>
+        <w:rPr>
+          <w:rFonts w:eastAsiaTheme="minorEastAsia" w:hint="eastAsia"/>
+          <w:lang w:eastAsia="ja-JP"/>
+        </w:rPr>
+      </w:pPr>
+    </w:p>
+    <w:p>
+      <w:pPr>
         <w:pStyle w:val="FirstParagraph"/>
       </w:pPr>
       <w:r>
@@ -2068,6 +2119,7 @@
             <w:rPr>
               <w:rFonts w:ascii="Cambria Math" w:hAnsi="Cambria Math"/>
             </w:rPr>
+            <w:lastRenderedPageBreak/>
             <m:t>Q</m:t>
           </m:r>
           <m:r>
@@ -2479,7 +2531,6 @@
         <w:pStyle w:val="BodyText"/>
       </w:pPr>
       <w:r>
-        <w:lastRenderedPageBreak/>
         <w:t xml:space="preserve">Furthermore, this baseline D3QN architecture is significantly upgraded into an </w:t>
       </w:r>
       <w:r>
@@ -3479,7 +3530,25 @@
                 <w:rFonts w:ascii="Courier New" w:hAnsi="Courier New"/>
                 <w:sz w:val="14"/>
               </w:rPr>
-              <w:t xml:space="preserve">    Reset WebSecurityGym Environment</w:t>
+              <w:t xml:space="preserve">    Reset </w:t>
+            </w:r>
+            <w:proofErr w:type="spellStart"/>
+            <w:r>
+              <w:rPr>
+                <w:rStyle w:val="VerbatimChar"/>
+                <w:rFonts w:ascii="Courier New" w:hAnsi="Courier New"/>
+                <w:sz w:val="14"/>
+              </w:rPr>
+              <w:t>WebSecurityGym</w:t>
+            </w:r>
+            <w:proofErr w:type="spellEnd"/>
+            <w:r>
+              <w:rPr>
+                <w:rStyle w:val="VerbatimChar"/>
+                <w:rFonts w:ascii="Courier New" w:hAnsi="Courier New"/>
+                <w:sz w:val="14"/>
+              </w:rPr>
+              <w:t xml:space="preserve"> Environment</w:t>
             </w:r>
             <w:r>
               <w:br/>
@@ -7253,12 +7322,14 @@
       <w:r>
         <w:t xml:space="preserve">This paper presented an autonomous web vulnerability scanner driven by an Extended Double Dueling Deep Q-Network (Extended D3QN) agent. By formalizing the web exploitation process as a Markov Decision Process (MDP) and training the agent in a custom </w:t>
       </w:r>
+      <w:proofErr w:type="spellStart"/>
       <w:r>
         <w:rPr>
           <w:rStyle w:val="VerbatimChar"/>
         </w:rPr>
         <w:t>WebSecurityGym</w:t>
       </w:r>
+      <w:proofErr w:type="spellEnd"/>
       <w:r>
         <w:t xml:space="preserve"> environment, we demonstrated that Reinforcement Learning can effectively replicate and scale the cognitive processes of human penetration testers. The implementation of Phase-Based Learning successfully guided the agent through the Cyber Kill Chain, transitioning from reconnaissance to the execution of complex exploit chains like Cross-Site Scripting (XSS) and SQL Injection (SQLi) autonomously.</w:t>
       </w:r>
@@ -7716,6 +7787,95 @@
       <w:lvlJc w:val="left"/>
       <w:pPr>
         <w:ind w:left="6480" w:hanging="360"/>
+      </w:pPr>
+    </w:lvl>
+  </w:abstractNum>
+  <w:abstractNum w:abstractNumId="3" w15:restartNumberingAfterBreak="0">
+    <w:nsid w:val="2DD576F2"/>
+    <w:multiLevelType w:val="hybridMultilevel"/>
+    <w:tmpl w:val="43A43B88"/>
+    <w:lvl w:ilvl="0" w:tplc="04090015">
+      <w:start w:val="1"/>
+      <w:numFmt w:val="upperLetter"/>
+      <w:lvlText w:val="%1."/>
+      <w:lvlJc w:val="left"/>
+      <w:pPr>
+        <w:ind w:left="720" w:hanging="360"/>
+      </w:pPr>
+      <w:rPr>
+        <w:rFonts w:hint="default"/>
+      </w:rPr>
+    </w:lvl>
+    <w:lvl w:ilvl="1" w:tplc="04090019" w:tentative="1">
+      <w:start w:val="1"/>
+      <w:numFmt w:val="lowerLetter"/>
+      <w:lvlText w:val="%2."/>
+      <w:lvlJc w:val="left"/>
+      <w:pPr>
+        <w:ind w:left="1440" w:hanging="360"/>
+      </w:pPr>
+    </w:lvl>
+    <w:lvl w:ilvl="2" w:tplc="0409001B" w:tentative="1">
+      <w:start w:val="1"/>
+      <w:numFmt w:val="lowerRoman"/>
+      <w:lvlText w:val="%3."/>
+      <w:lvlJc w:val="right"/>
+      <w:pPr>
+        <w:ind w:left="2160" w:hanging="180"/>
+      </w:pPr>
+    </w:lvl>
+    <w:lvl w:ilvl="3" w:tplc="0409000F" w:tentative="1">
+      <w:start w:val="1"/>
+      <w:numFmt w:val="decimal"/>
+      <w:lvlText w:val="%4."/>
+      <w:lvlJc w:val="left"/>
+      <w:pPr>
+        <w:ind w:left="2880" w:hanging="360"/>
+      </w:pPr>
+    </w:lvl>
+    <w:lvl w:ilvl="4" w:tplc="04090019" w:tentative="1">
+      <w:start w:val="1"/>
+      <w:numFmt w:val="lowerLetter"/>
+      <w:lvlText w:val="%5."/>
+      <w:lvlJc w:val="left"/>
+      <w:pPr>
+        <w:ind w:left="3600" w:hanging="360"/>
+      </w:pPr>
+    </w:lvl>
+    <w:lvl w:ilvl="5" w:tplc="0409001B" w:tentative="1">
+      <w:start w:val="1"/>
+      <w:numFmt w:val="lowerRoman"/>
+      <w:lvlText w:val="%6."/>
+      <w:lvlJc w:val="right"/>
+      <w:pPr>
+        <w:ind w:left="4320" w:hanging="180"/>
+      </w:pPr>
+    </w:lvl>
+    <w:lvl w:ilvl="6" w:tplc="0409000F" w:tentative="1">
+      <w:start w:val="1"/>
+      <w:numFmt w:val="decimal"/>
+      <w:lvlText w:val="%7."/>
+      <w:lvlJc w:val="left"/>
+      <w:pPr>
+        <w:ind w:left="5040" w:hanging="360"/>
+      </w:pPr>
+    </w:lvl>
+    <w:lvl w:ilvl="7" w:tplc="04090019" w:tentative="1">
+      <w:start w:val="1"/>
+      <w:numFmt w:val="lowerLetter"/>
+      <w:lvlText w:val="%8."/>
+      <w:lvlJc w:val="left"/>
+      <w:pPr>
+        <w:ind w:left="5760" w:hanging="360"/>
+      </w:pPr>
+    </w:lvl>
+    <w:lvl w:ilvl="8" w:tplc="0409001B" w:tentative="1">
+      <w:start w:val="1"/>
+      <w:numFmt w:val="lowerRoman"/>
+      <w:lvlText w:val="%9."/>
+      <w:lvlJc w:val="right"/>
+      <w:pPr>
+        <w:ind w:left="6480" w:hanging="180"/>
       </w:pPr>
     </w:lvl>
   </w:abstractNum>
@@ -7760,6 +7920,9 @@
   </w:num>
   <w:num w:numId="5" w16cid:durableId="386998545">
     <w:abstractNumId w:val="1"/>
+  </w:num>
+  <w:num w:numId="6" w16cid:durableId="2101944142">
+    <w:abstractNumId w:val="3"/>
   </w:num>
 </w:numbering>
 </file>

</xml_diff>